<commit_message>
vault backup: 2026-03-27 20:08:12
</commit_message>
<xml_diff>
--- a/30_コンテンツ/フルパッケージ/アンナチュラル_臨床検査技師_2026-03-27_v1.0.docx
+++ b/30_コンテンツ/フルパッケージ/アンナチュラル_臨床検査技師_2026-03-27_v1.0.docx
@@ -140,7 +140,7 @@
     </w:p>
     <w:p>
       <w:r>
-        <w:t>A cinematic and emotional anime style illustration of a busy hospital laboratory scene, showing a female technician working intensely while a male doctor impatiently waits at the doorway checking his watch. The contrast between the careful precision of the lab work and the pressure from outside creates emotional tension. Warm indoor lighting mixed with cool fluorescent lab lights. Masterpiece, highly detailed, cel-shaded, soft rim lighting, vibrant colors. Aspect ratio 16:9</w:t>
+        <w:t>A cinematic and emotional anime style illustration of a hospital hallway scene, where a tired-looking female lab technician in a white coat walks briskly carrying a stack of test result papers, while in the background a male doctor and nurses are visibly waiting and watching her with urgency. The perspective emphasizes her from behind, isolated and pressured, walking alone through a long clinical corridor with fluorescent lighting casting harsh shadows. The mood conveys invisible dedication under constant pressure. Masterpiece, highly detailed, cel-shaded, soft rim lighting, vibrant colors. Aspect ratio 16:9</w:t>
       </w:r>
     </w:p>
     <w:p>
@@ -1045,16 +1045,20 @@
         <w:t>&lt;!-- /wp:loos/balloon --&gt;</w:t>
         <w:br/>
         <w:br/>
-        <w:t>[blog_parts id="2673"]</w:t>
+        <w:t>&lt;!-- wp:paragraph {"className":"u-mb-ctrl u-mb-0"} --&gt;</w:t>
+        <w:br/>
+        <w:t>&lt;p class="u-mb-ctrl u-mb-0"&gt;[blog_parts id="2673"]&lt;/p&gt;</w:t>
+        <w:br/>
+        <w:t>&lt;!-- /wp:paragraph --&gt;</w:t>
         <w:br/>
         <w:br/>
         <w:br/>
         <w:t>&lt;!-- ========== 処方箋 ========== --&gt;</w:t>
         <w:br/>
         <w:br/>
-        <w:t>&lt;!-- wp:heading --&gt;</w:t>
-        <w:br/>
-        <w:t>&lt;h2 class="wp-block-heading"&gt;【本日の処方箋】アンナチュラルから学ぶ3つの行動指針&lt;/h2&gt;</w:t>
+        <w:t>&lt;!-- wp:heading {"className":"u-mt-ctrl u-mt-0"} --&gt;</w:t>
+        <w:br/>
+        <w:t>&lt;h2 class="wp-block-heading u-mt-ctrl u-mt-0"&gt;【本日の処方箋】アンナチュラルから学ぶ3つの行動指針&lt;/h2&gt;</w:t>
         <w:br/>
         <w:t>&lt;!-- /wp:heading --&gt;</w:t>
         <w:br/>
@@ -1207,16 +1211,20 @@
         <w:t>&lt;!-- /wp:loos/balloon --&gt;</w:t>
         <w:br/>
         <w:br/>
-        <w:t>[blog_parts id="2673"]</w:t>
+        <w:t>&lt;!-- wp:paragraph {"className":"u-mb-ctrl u-mb-0"} --&gt;</w:t>
+        <w:br/>
+        <w:t>&lt;p class="u-mb-ctrl u-mb-0"&gt;[blog_parts id="2673"]&lt;/p&gt;</w:t>
+        <w:br/>
+        <w:t>&lt;!-- /wp:paragraph --&gt;</w:t>
         <w:br/>
         <w:br/>
         <w:br/>
         <w:t>&lt;!-- ========== 本日のカンファレンス ========== --&gt;</w:t>
         <w:br/>
         <w:br/>
-        <w:t>&lt;!-- wp:heading --&gt;</w:t>
-        <w:br/>
-        <w:t>&lt;h2 class="wp-block-heading"&gt;本日のカンファレンス&lt;/h2&gt;</w:t>
+        <w:t>&lt;!-- wp:heading {"className":"u-mt-ctrl u-mt-0"} --&gt;</w:t>
+        <w:br/>
+        <w:t>&lt;h2 class="wp-block-heading u-mt-ctrl u-mt-0"&gt;本日のカンファレンス&lt;/h2&gt;</w:t>
         <w:br/>
         <w:t>&lt;!-- /wp:heading --&gt;</w:t>
         <w:br/>
@@ -1286,6 +1294,59 @@
     <w:p>
       <w:r>
         <w:t>#エッセイ #note #スキしてみて #アンナチュラル #臨床検査技師 #看護師 #チーム医療</w:t>
+      </w:r>
+    </w:p>
+    <w:p>
+      <w:pPr>
+        <w:pStyle w:val="Heading1"/>
+      </w:pPr>
+      <w:r>
+        <w:t>【7】ドラマ考察ジャーナリング用・橋渡し文</w:t>
+      </w:r>
+    </w:p>
+    <w:p>
+      <w:r>
+        <w:t>noteドラマ考察記事の末尾（まとめの後・タグの前）に差し込む誘導文です。リンク部分を差し替えてそのまま使えます。</w:t>
+      </w:r>
+    </w:p>
+    <w:p>
+      <w:pPr>
+        <w:pStyle w:val="Heading3"/>
+      </w:pPr>
+      <w:r>
+        <w:t>アンナチュラル用（推奨）</w:t>
+      </w:r>
+    </w:p>
+    <w:p>
+      <w:r>
+        <w:t>アンナチュラルを観ていると、「見えていない場所で誰かが支えている」という事実を突きつけられます。</w:t>
+        <w:br/>
+        <w:br/>
+        <w:t>東海林が黙々と検査データを出し続けるように——26年間、僕も誰にも気づかれない場所で動いてきた時間がありました。その経験を、リアルな言葉で書いた記事があります。</w:t>
+        <w:br/>
+        <w:br/>
+        <w:t>▶ 【アンナチュラル】臨床検査技師は何してる？｜現役ナースが語る"見えない仕事"の正体</w:t>
+        <w:br/>
+        <w:t>https://nurse-x-sekando.com/（※公開後にURLを差し替えてください）</w:t>
+      </w:r>
+    </w:p>
+    <w:p>
+      <w:pPr>
+        <w:pStyle w:val="Heading3"/>
+      </w:pPr>
+      <w:r>
+        <w:t>汎用版（どのドラマ考察にも使える）</w:t>
+      </w:r>
+    </w:p>
+    <w:p>
+      <w:r>
+        <w:t>ドラマの中のシーンが、私の記憶と重なることがあります。</w:t>
+        <w:br/>
+        <w:br/>
+        <w:t>26年間、現場に立ち続けた看護師として感じてきたことを、リアルな記事にも書いています。よかったら、こちらも読んでいただけると嬉しいです。</w:t>
+        <w:br/>
+        <w:br/>
+        <w:t>▶ [（リアル記事タイトルをここに入れる）]（リンクをここに入れる）</w:t>
       </w:r>
     </w:p>
     <w:sectPr>

</xml_diff>